<commit_message>
Adicionado link do repositório no documento ATPS Michael Machado.docx.
</commit_message>
<xml_diff>
--- a/ATPS Michael Machado.docx
+++ b/ATPS Michael Machado.docx
@@ -321,6 +321,14 @@
         </w:rPr>
         <w:t xml:space="preserve">1. Link do Repositório GitHub: </w:t>
       </w:r>
+      <w:r>
+        <w:rPr>
+          <w:rFonts w:ascii="Times New Roman" w:hAnsi="Times New Roman" w:cs="Times New Roman"/>
+          <w:sz w:val="24"/>
+          <w:szCs w:val="24"/>
+        </w:rPr>
+        <w:t>https://github.com/MikeMacCav/projeto-lar-amigo/tree/main</w:t>
+      </w:r>
     </w:p>
     <w:p>
       <w:pPr>
@@ -545,6 +553,7 @@
           <w:sz w:val="24"/>
           <w:szCs w:val="24"/>
         </w:rPr>
+        <w:lastRenderedPageBreak/>
         <w:t>- Elementos de Feedback: Botões e links com efeitos visuais ao passar o mouse (hover), indicando áreas clicáveis.</w:t>
       </w:r>
     </w:p>
@@ -1028,6 +1037,7 @@
   <w:style w:type="character" w:default="1" w:styleId="Fontepargpadro">
     <w:name w:val="Default Paragraph Font"/>
     <w:uiPriority w:val="1"/>
+    <w:semiHidden/>
     <w:unhideWhenUsed/>
   </w:style>
   <w:style w:type="table" w:default="1" w:styleId="Tabelanormal">
@@ -1414,7 +1424,7 @@
   <a:extraClrSchemeLst/>
   <a:extLst>
     <a:ext uri="{05A4C25C-085E-4340-85A3-A5531E510DB2}">
-      <thm15:themeFamily xmlns:thm15="http://schemas.microsoft.com/office/thememl/2012/main" xmlns="" name="Office Theme" id="{62F939B6-93AF-4DB8-9C6B-D6C7DFDC589F}" vid="{4A3C46E8-61CC-4603-A589-7422A47A8E4A}"/>
+      <thm15:themeFamily xmlns="" xmlns:thm15="http://schemas.microsoft.com/office/thememl/2012/main" name="Office Theme" id="{62F939B6-93AF-4DB8-9C6B-D6C7DFDC589F}" vid="{4A3C46E8-61CC-4603-A589-7422A47A8E4A}"/>
     </a:ext>
   </a:extLst>
 </a:theme>

</xml_diff>

<commit_message>
Atualização do último commit.
</commit_message>
<xml_diff>
--- a/ATPS Michael Machado.docx
+++ b/ATPS Michael Machado.docx
@@ -321,14 +321,17 @@
         </w:rPr>
         <w:t xml:space="preserve">1. Link do Repositório GitHub: </w:t>
       </w:r>
-      <w:r>
-        <w:rPr>
-          <w:rFonts w:ascii="Times New Roman" w:hAnsi="Times New Roman" w:cs="Times New Roman"/>
-          <w:sz w:val="24"/>
-          <w:szCs w:val="24"/>
-        </w:rPr>
-        <w:t>https://github.com/MikeMacCav/projeto-lar-amigo/tree/main</w:t>
-      </w:r>
+      <w:hyperlink r:id="rId6" w:history="1">
+        <w:r>
+          <w:rPr>
+            <w:rStyle w:val="Hyperlink"/>
+            <w:rFonts w:ascii="Times New Roman" w:hAnsi="Times New Roman" w:cs="Times New Roman"/>
+            <w:sz w:val="24"/>
+            <w:szCs w:val="24"/>
+          </w:rPr>
+          <w:t>https://github.com/MikeMacCav/projeto-lar-amigo/tree/master</w:t>
+        </w:r>
+      </w:hyperlink>
     </w:p>
     <w:p>
       <w:pPr>
@@ -658,12 +661,12 @@
       </w:r>
     </w:p>
     <w:sectPr>
-      <w:headerReference w:type="even" r:id="rId6"/>
-      <w:headerReference w:type="default" r:id="rId7"/>
-      <w:footerReference w:type="even" r:id="rId8"/>
-      <w:footerReference w:type="default" r:id="rId9"/>
-      <w:headerReference w:type="first" r:id="rId10"/>
-      <w:footerReference w:type="first" r:id="rId11"/>
+      <w:headerReference w:type="even" r:id="rId7"/>
+      <w:headerReference w:type="default" r:id="rId8"/>
+      <w:footerReference w:type="even" r:id="rId9"/>
+      <w:footerReference w:type="default" r:id="rId10"/>
+      <w:headerReference w:type="first" r:id="rId11"/>
+      <w:footerReference w:type="first" r:id="rId12"/>
       <w:pgSz w:w="11906" w:h="16838"/>
       <w:pgMar w:top="1417" w:right="1701" w:bottom="1417" w:left="1701" w:header="708" w:footer="708" w:gutter="0"/>
       <w:cols w:space="708"/>
@@ -1131,6 +1134,17 @@
         <w:right w:w="108" w:type="dxa"/>
       </w:tblCellMar>
     </w:tblPr>
+  </w:style>
+  <w:style w:type="character" w:styleId="Hyperlink">
+    <w:name w:val="Hyperlink"/>
+    <w:basedOn w:val="Fontepargpadro"/>
+    <w:uiPriority w:val="99"/>
+    <w:unhideWhenUsed/>
+    <w:rsid w:val="003A19F3"/>
+    <w:rPr>
+      <w:color w:val="0563C1" w:themeColor="hyperlink"/>
+      <w:u w:val="single"/>
+    </w:rPr>
   </w:style>
 </w:styles>
 </file>
@@ -1424,7 +1438,7 @@
   <a:extraClrSchemeLst/>
   <a:extLst>
     <a:ext uri="{05A4C25C-085E-4340-85A3-A5531E510DB2}">
-      <thm15:themeFamily xmlns="" xmlns:thm15="http://schemas.microsoft.com/office/thememl/2012/main" name="Office Theme" id="{62F939B6-93AF-4DB8-9C6B-D6C7DFDC589F}" vid="{4A3C46E8-61CC-4603-A589-7422A47A8E4A}"/>
+      <thm15:themeFamily xmlns:thm15="http://schemas.microsoft.com/office/thememl/2012/main" xmlns="" name="Office Theme" id="{62F939B6-93AF-4DB8-9C6B-D6C7DFDC589F}" vid="{4A3C46E8-61CC-4603-A589-7422A47A8E4A}"/>
     </a:ext>
   </a:extLst>
 </a:theme>

</xml_diff>